<commit_message>
Fill team details in documents and regenerate Phase 2 PDF
Replace <Team Name>/<Name>/<SRN>/<Author>/<Date> placeholders in the SRS, HLD,
SW Design, Validation Spec and Project Plan; regenerate docs/20.pdf; add team
details and update D12 in DEVIATIONS.md.

Co-Authored-By: Claude Sonnet 5.5 <noreply@anthropic.com>
Claude-Session: https://claude.ai/code/session_018mmSZcjmxJnMDuLzMoALrg
</commit_message>
<xml_diff>
--- a/docs/High_Level_Architecture_Document.docx
+++ b/docs/High_Level_Architecture_Document.docx
@@ -211,7 +211,7 @@
                 <w:b w:val="false"/>
                 <w:bCs w:val="false"/>
               </w:rPr>
-              <w:t xml:space="preserve">&lt;Team Name&gt;</w:t>
+              <w:t>SE GROUP</w:t>
             </w:r>
           </w:p>
         </w:tc>
@@ -261,7 +261,7 @@
                 <w:b w:val="false"/>
                 <w:bCs w:val="false"/>
               </w:rPr>
-              <w:t xml:space="preserve">&lt;Name&gt;  |  SRN: &lt;SRN&gt;</w:t>
+              <w:t>MITHUN S  |  SRN: PES2UG24AM208</w:t>
             </w:r>
           </w:p>
         </w:tc>
@@ -311,7 +311,7 @@
                 <w:b w:val="false"/>
                 <w:bCs w:val="false"/>
               </w:rPr>
-              <w:t xml:space="preserve">&lt;Name&gt;  |  SRN: &lt;SRN&gt;</w:t>
+              <w:t>BHARATH H G  |  SRN: PES2UG24AM197</w:t>
             </w:r>
           </w:p>
         </w:tc>
@@ -361,7 +361,7 @@
                 <w:b w:val="false"/>
                 <w:bCs w:val="false"/>
               </w:rPr>
-              <w:t xml:space="preserve">&lt;Name&gt;  |  SRN: &lt;SRN&gt;</w:t>
+              <w:t>VARUN C H  |  SRN: PES2UG24AM180</w:t>
             </w:r>
           </w:p>
         </w:tc>
@@ -411,7 +411,7 @@
                 <w:b w:val="false"/>
                 <w:bCs w:val="false"/>
               </w:rPr>
-              <w:t xml:space="preserve">&lt;Name&gt;  |  SRN: &lt;SRN&gt;</w:t>
+              <w:t>YASHWANT ADITYA VARMA  |  SRN: PES2UG24AM190</w:t>
             </w:r>
           </w:p>
         </w:tc>
@@ -461,7 +461,7 @@
                 <w:b w:val="false"/>
                 <w:bCs w:val="false"/>
               </w:rPr>
-              <w:t xml:space="preserve">&lt;Author Name(s)&gt;</w:t>
+              <w:t>MITHUN S</w:t>
             </w:r>
           </w:p>
         </w:tc>
@@ -511,7 +511,7 @@
                 <w:b w:val="false"/>
                 <w:bCs w:val="false"/>
               </w:rPr>
-              <w:t xml:space="preserve">&lt;DD Month 2026&gt;</w:t>
+              <w:t>5.10.2026</w:t>
             </w:r>
           </w:p>
         </w:tc>
@@ -680,7 +680,7 @@
                 <w:b w:val="false"/>
                 <w:bCs w:val="false"/>
               </w:rPr>
-              <w:t xml:space="preserve">&lt;Name&gt;</w:t>
+              <w:t>MITHUN S</w:t>
             </w:r>
           </w:p>
         </w:tc>
@@ -704,7 +704,7 @@
                 <w:b w:val="false"/>
                 <w:bCs w:val="false"/>
               </w:rPr>
-              <w:t xml:space="preserve">&lt;Date&gt;</w:t>
+              <w:t>5.10.2026</w:t>
             </w:r>
           </w:p>
         </w:tc>

</xml_diff>